<commit_message>
LCO-5042: Address review feedback on parenthesised LISTNUM handling
- Numbering3.cs: HandleNamedListNum now picks the first LISTNUM match
  in a paragraph whose name actually resolves via GetAbstractNum,
  instead of the first match regardless of resolution. Fixes a
  potential null dereference and handles paragraphs with multiple
  LISTNUM fields where an earlier name is unresolved.
- ListNum.cs: CatchAllListNums now checks GetAbstractNum resolves
  before calling FormatNumber for a named, parenthesised-level field.
  Falls back to '(1)' instead of throwing when the name doesn't
  resolve to an abstract numbering definition.
- field-codes.docx/xml: add a source-derived regression case using
  the real 'LISTNUM  seq1 \l (2) \s 1' field found in the Springwell
  Solar DCO, pinning the parenthesised-level behaviour that was
  previously uncovered by any fixture.
</commit_message>
<xml_diff>
--- a/test/lawmaker/wsi/field-codes.docx
+++ b/test/lawmaker/wsi/field-codes.docx
@@ -3753,6 +3753,30 @@
       </w:r>
       <w:r>
         <w:t>(2)(a).</w:t>
+      </w:r>
+    </w:p>
+    <w:p>
+      <w:pPr>
+        <w:pStyle w:val="N1"/>
+        <w:numPr>
+          <w:ilvl w:val="0"/>
+          <w:numId w:val="0"/>
+        </w:numPr>
+      </w:pPr>
+      <w:r>
+        <w:t>—</w:t>
+      </w:r>
+      <w:r>
+        <w:fldChar w:fldCharType="begin"/>
+      </w:r>
+      <w:r>
+        <w:instrText xml:space="preserve"> LISTNUM  seq1 \l (2) \s 1 </w:instrText>
+      </w:r>
+      <w:r>
+        <w:fldChar w:fldCharType="end"/>
+      </w:r>
+      <w:r>
+        <w:t xml:space="preserve"> LCO-5042 regression: parenthesised LISTNUM level digit.</w:t>
       </w:r>
     </w:p>
     <w:p>

</xml_diff>